<commit_message>
Rewrite cover letter: lead with subject-specific teaching software (CPU Rush et al), concise
</commit_message>
<xml_diff>
--- a/Mahesh_Basavaraj_Cover_Letter_UNSW.docx
+++ b/Mahesh_Basavaraj_Cover_Letter_UNSW.docx
@@ -241,7 +241,7 @@
           <w:color w:val="333F4A"/>
           <w:sz w:val="19"/>
         </w:rPr>
-        <w:t>I am writing to apply for the position of Assistant Professor, Computer Science, at the UNSW Bengaluru campus. I am currently Assistant Professor in Computer Science &amp; Engineering (Data Science) at Dayananda Sagar Academy of Technology &amp; Management, Bengaluru, and a doctoral researcher at Visvesvaraya Technological University. My career spans sixteen years across the two worlds this campus sits between: eight years building enterprise and banking software at Infosys and Accenture, and eight years teaching computer science and publishing applied AI research in Bengaluru.</w:t>
+        <w:t>I am applying for the position of Assistant Professor, Computer Science, at the UNSW Bengaluru campus. I am currently Assistant Professor in CSE (Data Science) at DSATM, Bengaluru, and a doctoral researcher at Visvesvaraya Technological University. My sixteen years split evenly between the two worlds this campus sits between: eight years building banking and capital-markets software at Infosys and Accenture, and eight years teaching computer science and publishing applied AI research. What I would most want you to know about me is simple: when a course needs software to make its ideas visible, I build it.</w:t>
       </w:r>
     </w:p>
     <w:p>
@@ -257,7 +257,7 @@
           <w:color w:val="333F4A"/>
           <w:sz w:val="19"/>
         </w:rPr>
-        <w:t>Teaching is the part of my work I have invested in most deliberately. At DSATM I designed and led a six-month Agentic AI immersion programme for students in partnership with Capabl, and I run faculty development programmes for colleagues. I have taught object-oriented programming, data structures, operating systems, database systems and deep learning to undergraduate and postgraduate students, and I supervise final-year capstone projects end to end. My approach is constructionist: students should build systems and watch them behave, not memorise definitions. To make that possible at scale I build my own teaching tools — an interactive Socratic game in which students predict operating-system scheduling, paging and deadlock behaviour and are graded on every decision; a progressive, scored decision track for learning data structures; and classroom CI/CD projects where every push is tested and gated. These are public on GitHub and in daily classroom use. I am ready to adopt UNSW's myExperience design framework and the Integrated Curriculum Framework, to work within standards-based, criterion-referenced assessment, and to complete the Ready to Teach programme alongside colleagues from Kensington.</w:t>
+        <w:t>CPU Rush is the clearest example. My Operating Systems students do not read about scheduling, paging, deadlock and file systems — they predict how each behaves, commit to an answer, and a server grades every decision. Data Structure Design Studio turns data structures into a progressive, scored decision track under changing constraints. Game Forge generates single-file browser games, one concept each, from an editable design doctrine. ButterCloud Quiz asks students to choose the best stack and architecture for Eight such tools are public at github.com/maheshbasavaraj, most in daily classroom use, and every new course I teach keeps producing more — students decide, then watch the machine answer, which is where the learning actually happens.</w:t>
       </w:r>
     </w:p>
     <w:p>
@@ -273,7 +273,7 @@
           <w:color w:val="333F4A"/>
           <w:sz w:val="19"/>
         </w:rPr>
-        <w:t>My research is in Agentic AI, large language models and spatio-temporal deep learning. I hold three utility patents — in adaptive quality of service for heterogeneous IoT networks, ethical AI and bias mitigation, and machine-assisted agricultural automation — together with a published patent application in synchronised social-VR IoT networks, and more than ten peer-reviewed papers, including recent work on multi-scale spatio-temporal networks with frequency–spatial parallel attention, lightweight multi-agent Q-learning for wireless IoT, and LLM-based agent systems as a route to general intelligence. The campus's focus on artificial intelligence, and its Centre of Excellence in AI and Innovation with Deloitte India, is precisely where I want to work: applied, industry-connected research that produces both publications and capability.</w:t>
+        <w:t>I have taught object-oriented programming, data structures, operating systems, database systems and deep learning at undergraduate and postgraduate level, and I supervise final-year capstone projects end to end. At DSATM I designed and led a six-month Agentic AI immersion programme with Capabl and run faculty development programmes for colleagues. I am ready to adopt UNSW's myExperience framework and the Integrated Curriculum Framework, to work within standards-based, criterion-referenced assessment, and to complete Ready to Teach alongside colleagues from Kensington.</w:t>
       </w:r>
     </w:p>
     <w:p>
@@ -289,7 +289,7 @@
           <w:color w:val="333F4A"/>
           <w:sz w:val="19"/>
         </w:rPr>
-        <w:t>Eight years in industry also taught me what employers expect from a computer science graduate, and how to build that expectation into assessment. At Infosys I worked on Finacle, the universal banking platform; at Accenture I built capital-markets systems for international clients. I can bring those networks and that experience into work-integrated learning — authentic industry projects, internship pipelines, and assessment built around real repositories, code review and delivery discipline.</w:t>
+        <w:t>My research — Agentic AI, large language models and spatio-temporal deep learning — has produced three utility patents, a published patent application in synchronised social-VR IoT networks, and eleven peer-reviewed papers, including recent work on multi-scale spatio-temporal attention networks, lightweight multi-agent Q-learning for wireless IoT, and LLM-based agent systems as a route to general intelligence. The campus's focus on artificial intelligence, and its Centre of Excellence in AI and Innovation with Deloitte India, is where I want to work: applied research that produces both publications and capability.</w:t>
       </w:r>
     </w:p>
     <w:p>
@@ -305,7 +305,7 @@
           <w:color w:val="333F4A"/>
           <w:sz w:val="19"/>
         </w:rPr>
-        <w:t>What draws me to UNSW Bengaluru specifically is a top-20 global degree with local consequence. Progress for All is a mission I can teach to, and the chance to help establish the standards of a new campus rather than inherit them is rare. I am based in Bengaluru and ready to contribute from the first teaching period.</w:t>
+        <w:t>Eight years in industry also taught me what employers expect from a computer science graduate. At Infosys I worked on Finacle, the universal banking platform; at Accenture I built capital-markets systems for international clients. I would bring that into work-integrated learning — industry projects, internship pipelines, and assessment built around real repositories, code review and delivery discipline.</w:t>
       </w:r>
     </w:p>
     <w:p>
@@ -321,7 +321,7 @@
           <w:color w:val="333F4A"/>
           <w:sz w:val="19"/>
         </w:rPr>
-        <w:t>I would welcome the opportunity to discuss the role, and I am glad to deliver a teaching demonstration on any topic in the computer science curriculum.</w:t>
+        <w:t>UNSW Bengaluru offers a top-20 global degree with local consequence, and Progress for All is a mission I can teach to. The chance to help establish a new campus's standards rather than inherit them is rare. I am based in Bengaluru, ready from the first teaching period, and glad to demonstrate CPU Rush live or teach a class on any topic in the curriculum.</w:t>
       </w:r>
     </w:p>
     <w:p>

</xml_diff>

<commit_message>
Cover letter: same two-column format as packet, four teaching tools as list, first-principles/case-study/hands-on method; teaching doc gains method para
</commit_message>
<xml_diff>
--- a/Mahesh_Basavaraj_Cover_Letter_UNSW.docx
+++ b/Mahesh_Basavaraj_Cover_Letter_UNSW.docx
@@ -2,417 +2,1176 @@
 <file path=word/document.xml><?xml version="1.0" encoding="utf-8"?>
 <w:document xmlns:wpc="http://schemas.microsoft.com/office/word/2010/wordprocessingCanvas" xmlns:mo="http://schemas.microsoft.com/office/mac/office/2008/main" xmlns:mc="http://schemas.openxmlformats.org/markup-compatibility/2006" xmlns:mv="urn:schemas-microsoft-com:mac:vml" xmlns:o="urn:schemas-microsoft-com:office:office" xmlns:r="http://schemas.openxmlformats.org/officeDocument/2006/relationships" xmlns:m="http://schemas.openxmlformats.org/officeDocument/2006/math" xmlns:v="urn:schemas-microsoft-com:vml" xmlns:wp14="http://schemas.microsoft.com/office/word/2010/wordprocessingDrawing" xmlns:wp="http://schemas.openxmlformats.org/drawingml/2006/wordprocessingDrawing" xmlns:w10="urn:schemas-microsoft-com:office:word" xmlns:w="http://schemas.openxmlformats.org/wordprocessingml/2006/main" xmlns:w14="http://schemas.microsoft.com/office/word/2010/wordml" xmlns:wpg="http://schemas.microsoft.com/office/word/2010/wordprocessingGroup" xmlns:wpi="http://schemas.microsoft.com/office/word/2010/wordprocessingInk" xmlns:wne="http://schemas.microsoft.com/office/word/2006/wordml" xmlns:wps="http://schemas.microsoft.com/office/word/2010/wordprocessingShape" mc:Ignorable="w14 wp14">
   <w:body>
+    <w:tbl>
+      <w:tblPr>
+        <w:tblW w:type="auto" w:w="0"/>
+        <w:jc w:val="left"/>
+        <w:tblLayout w:type="fixed"/>
+        <w:tblLook w:firstColumn="1" w:firstRow="1" w:lastColumn="0" w:lastRow="0" w:noHBand="0" w:noVBand="1" w:val="04A0"/>
+        <w:tblLayout w:type="fixed"/>
+        <w:tblInd w:w="0" w:type="dxa"/>
+      </w:tblPr>
+      <w:tblGrid>
+        <w:gridCol w:w="3741"/>
+        <w:gridCol w:w="8163"/>
+      </w:tblGrid>
+      <w:tr>
+        <w:trPr>
+          <w:trHeight w:val="16271" w:hRule="exact"/>
+          <w:cantSplit/>
+        </w:trPr>
+        <w:tc>
+          <w:tcPr>
+            <w:tcW w:type="dxa" w:w="3741"/>
+            <w:shd w:val="clear" w:color="auto" w:fill="F3F1EC"/>
+            <w:tcBorders>
+              <w:top w:val="nil"/>
+              <w:left w:val="nil"/>
+              <w:bottom w:val="nil"/>
+              <w:right w:val="single" w:sz="4" w:color="DCDFE2"/>
+            </w:tcBorders>
+            <w:tcMar>
+              <w:top w:w="737" w:type="dxa"/>
+              <w:left w:w="567" w:type="dxa"/>
+              <w:bottom w:w="453" w:type="dxa"/>
+              <w:right w:w="340" w:type="dxa"/>
+            </w:tcMar>
+          </w:tcPr>
+          <w:p>
+            <w:pPr>
+              <w:spacing w:before="0" w:after="120" w:line="276" w:lineRule="auto"/>
+            </w:pPr>
+            <w:r>
+              <w:drawing>
+                <wp:inline xmlns:a="http://schemas.openxmlformats.org/drawingml/2006/main" xmlns:pic="http://schemas.openxmlformats.org/drawingml/2006/picture">
+                  <wp:extent cx="1008000" cy="1008000"/>
+                  <wp:docPr id="1" name="Picture 1"/>
+                  <wp:cNvGraphicFramePr>
+                    <a:graphicFrameLocks noChangeAspect="1"/>
+                  </wp:cNvGraphicFramePr>
+                  <a:graphic>
+                    <a:graphicData uri="http://schemas.openxmlformats.org/drawingml/2006/picture">
+                      <pic:pic>
+                        <pic:nvPicPr>
+                          <pic:cNvPr id="0" name="photo_circle.png"/>
+                          <pic:cNvPicPr/>
+                        </pic:nvPicPr>
+                        <pic:blipFill>
+                          <a:blip r:embed="rId11"/>
+                          <a:stretch>
+                            <a:fillRect/>
+                          </a:stretch>
+                        </pic:blipFill>
+                        <pic:spPr>
+                          <a:xfrm>
+                            <a:off x="0" y="0"/>
+                            <a:ext cx="1008000" cy="1008000"/>
+                          </a:xfrm>
+                          <a:prstGeom prst="rect"/>
+                        </pic:spPr>
+                      </pic:pic>
+                    </a:graphicData>
+                  </a:graphic>
+                </wp:inline>
+              </w:drawing>
+            </w:r>
+          </w:p>
+          <w:p>
+            <w:pPr>
+              <w:spacing w:before="0" w:after="0" w:line="228" w:lineRule="auto"/>
+            </w:pPr>
+            <w:r>
+              <w:rPr>
+                <w:rFonts w:ascii="Georgia" w:hAnsi="Georgia" w:eastAsia="Georgia"/>
+                <w:b/>
+                <w:i w:val="0"/>
+                <w:caps w:val="0"/>
+                <w:color w:val="16202A"/>
+                <w:sz w:val="48"/>
+              </w:rPr>
+              <w:t>Mahesh</w:t>
+            </w:r>
+          </w:p>
+          <w:p>
+            <w:pPr>
+              <w:spacing w:before="0" w:after="80" w:line="228" w:lineRule="auto"/>
+            </w:pPr>
+            <w:r>
+              <w:rPr>
+                <w:rFonts w:ascii="Georgia" w:hAnsi="Georgia" w:eastAsia="Georgia"/>
+                <w:b/>
+                <w:i w:val="0"/>
+                <w:caps w:val="0"/>
+                <w:color w:val="0E5A5C"/>
+                <w:sz w:val="48"/>
+              </w:rPr>
+              <w:t>Basavaraj</w:t>
+            </w:r>
+          </w:p>
+          <w:p>
+            <w:pPr>
+              <w:spacing w:before="0" w:after="0" w:line="276" w:lineRule="auto"/>
+            </w:pPr>
+            <w:r>
+              <w:rPr>
+                <w:rFonts w:ascii="Calibri" w:hAnsi="Calibri" w:eastAsia="Calibri"/>
+                <w:b/>
+                <w:i w:val="0"/>
+                <w:caps/>
+                <w:color w:val="B8742A"/>
+                <w:sz w:val="16"/>
+                <w:spacing w:val="10"/>
+              </w:rPr>
+              <w:t>Educator · AI Researcher</w:t>
+            </w:r>
+          </w:p>
+          <w:p>
+            <w:pPr>
+              <w:keepNext/>
+              <w:spacing w:before="200" w:after="80" w:line="276" w:lineRule="auto"/>
+              <w:pBdr>
+                <w:bottom w:val="single" w:sz="4" w:space="1" w:color="DCDFE2"/>
+              </w:pBdr>
+            </w:pPr>
+            <w:r>
+              <w:rPr>
+                <w:rFonts w:ascii="Calibri" w:hAnsi="Calibri" w:eastAsia="Calibri"/>
+                <w:b/>
+                <w:i w:val="0"/>
+                <w:caps/>
+                <w:color w:val="0E5A5C"/>
+                <w:sz w:val="16"/>
+                <w:spacing w:val="40"/>
+              </w:rPr>
+              <w:t>Contact</w:t>
+            </w:r>
+          </w:p>
+          <w:p>
+            <w:pPr>
+              <w:spacing w:before="0" w:after="0" w:line="276" w:lineRule="auto"/>
+            </w:pPr>
+            <w:r>
+              <w:rPr>
+                <w:rFonts w:ascii="Calibri" w:hAnsi="Calibri" w:eastAsia="Calibri"/>
+                <w:b w:val="0"/>
+                <w:i w:val="0"/>
+                <w:caps/>
+                <w:color w:val="5B6670"/>
+                <w:sz w:val="13"/>
+                <w:spacing w:val="20"/>
+              </w:rPr>
+              <w:t>Location</w:t>
+            </w:r>
+          </w:p>
+          <w:p>
+            <w:pPr>
+              <w:spacing w:before="0" w:after="60" w:line="276" w:lineRule="auto"/>
+            </w:pPr>
+            <w:r>
+              <w:rPr>
+                <w:rFonts w:ascii="Calibri" w:hAnsi="Calibri" w:eastAsia="Calibri"/>
+                <w:b w:val="0"/>
+                <w:i w:val="0"/>
+                <w:caps w:val="0"/>
+                <w:color w:val="16202A"/>
+                <w:sz w:val="17"/>
+              </w:rPr>
+              <w:t>Bengaluru, Karnataka, India</w:t>
+            </w:r>
+          </w:p>
+          <w:p>
+            <w:pPr>
+              <w:spacing w:before="0" w:after="0" w:line="276" w:lineRule="auto"/>
+            </w:pPr>
+            <w:r>
+              <w:rPr>
+                <w:rFonts w:ascii="Calibri" w:hAnsi="Calibri" w:eastAsia="Calibri"/>
+                <w:b w:val="0"/>
+                <w:i w:val="0"/>
+                <w:caps/>
+                <w:color w:val="5B6670"/>
+                <w:sz w:val="13"/>
+                <w:spacing w:val="20"/>
+              </w:rPr>
+              <w:t>Phone</w:t>
+            </w:r>
+          </w:p>
+          <w:p>
+            <w:pPr>
+              <w:spacing w:before="0" w:after="60" w:line="276" w:lineRule="auto"/>
+            </w:pPr>
+            <w:r>
+              <w:rPr>
+                <w:rFonts w:ascii="Calibri" w:hAnsi="Calibri" w:eastAsia="Calibri"/>
+                <w:b w:val="0"/>
+                <w:i w:val="0"/>
+                <w:caps w:val="0"/>
+                <w:color w:val="16202A"/>
+                <w:sz w:val="17"/>
+              </w:rPr>
+              <w:t>+91 98866 42542</w:t>
+            </w:r>
+          </w:p>
+          <w:p>
+            <w:pPr>
+              <w:spacing w:before="0" w:after="0" w:line="276" w:lineRule="auto"/>
+            </w:pPr>
+            <w:r>
+              <w:rPr>
+                <w:rFonts w:ascii="Calibri" w:hAnsi="Calibri" w:eastAsia="Calibri"/>
+                <w:b w:val="0"/>
+                <w:i w:val="0"/>
+                <w:caps/>
+                <w:color w:val="5B6670"/>
+                <w:sz w:val="13"/>
+                <w:spacing w:val="20"/>
+              </w:rPr>
+              <w:t>Email</w:t>
+            </w:r>
+          </w:p>
+          <w:p>
+            <w:pPr>
+              <w:spacing w:before="0" w:after="60" w:line="276" w:lineRule="auto"/>
+            </w:pPr>
+            <w:hyperlink r:id="rId12">
+              <w:r>
+                <w:rPr>
+                  <w:rFonts w:ascii="Calibri" w:hAnsi="Calibri"/>
+                  <w:color w:val="16202A"/>
+                  <w:sz w:val="17"/>
+                </w:rPr>
+                <w:t xml:space="preserve">mahesh-csds@dsatm.edu.in</w:t>
+              </w:r>
+            </w:hyperlink>
+          </w:p>
+          <w:p>
+            <w:pPr>
+              <w:spacing w:before="0" w:after="0" w:line="276" w:lineRule="auto"/>
+            </w:pPr>
+            <w:r>
+              <w:rPr>
+                <w:rFonts w:ascii="Calibri" w:hAnsi="Calibri" w:eastAsia="Calibri"/>
+                <w:b w:val="0"/>
+                <w:i w:val="0"/>
+                <w:caps/>
+                <w:color w:val="5B6670"/>
+                <w:sz w:val="13"/>
+                <w:spacing w:val="20"/>
+              </w:rPr>
+              <w:t>Email</w:t>
+            </w:r>
+          </w:p>
+          <w:p>
+            <w:pPr>
+              <w:spacing w:before="0" w:after="60" w:line="276" w:lineRule="auto"/>
+            </w:pPr>
+            <w:hyperlink r:id="rId13">
+              <w:r>
+                <w:rPr>
+                  <w:rFonts w:ascii="Calibri" w:hAnsi="Calibri"/>
+                  <w:color w:val="16202A"/>
+                  <w:sz w:val="17"/>
+                </w:rPr>
+                <w:t xml:space="preserve">BMaheshbasavaraj@gmail.com</w:t>
+              </w:r>
+            </w:hyperlink>
+          </w:p>
+          <w:p>
+            <w:pPr>
+              <w:spacing w:before="0" w:after="0" w:line="276" w:lineRule="auto"/>
+            </w:pPr>
+            <w:r>
+              <w:rPr>
+                <w:rFonts w:ascii="Calibri" w:hAnsi="Calibri" w:eastAsia="Calibri"/>
+                <w:b w:val="0"/>
+                <w:i w:val="0"/>
+                <w:caps/>
+                <w:color w:val="5B6670"/>
+                <w:sz w:val="13"/>
+                <w:spacing w:val="20"/>
+              </w:rPr>
+              <w:t>ORCID</w:t>
+            </w:r>
+          </w:p>
+          <w:p>
+            <w:pPr>
+              <w:spacing w:before="0" w:after="60" w:line="276" w:lineRule="auto"/>
+            </w:pPr>
+            <w:hyperlink r:id="rId14">
+              <w:r>
+                <w:rPr>
+                  <w:rFonts w:ascii="Calibri" w:hAnsi="Calibri"/>
+                  <w:color w:val="16202A"/>
+                  <w:sz w:val="16"/>
+                </w:rPr>
+                <w:t xml:space="preserve">0000-0002-2242-212X</w:t>
+              </w:r>
+            </w:hyperlink>
+          </w:p>
+          <w:p>
+            <w:pPr>
+              <w:spacing w:before="0" w:after="0" w:line="276" w:lineRule="auto"/>
+            </w:pPr>
+            <w:r>
+              <w:rPr>
+                <w:rFonts w:ascii="Calibri" w:hAnsi="Calibri" w:eastAsia="Calibri"/>
+                <w:b w:val="0"/>
+                <w:i w:val="0"/>
+                <w:caps/>
+                <w:color w:val="5B6670"/>
+                <w:sz w:val="13"/>
+                <w:spacing w:val="20"/>
+              </w:rPr>
+              <w:t>Google Scholar</w:t>
+            </w:r>
+          </w:p>
+          <w:p>
+            <w:pPr>
+              <w:spacing w:before="0" w:after="60" w:line="276" w:lineRule="auto"/>
+            </w:pPr>
+            <w:hyperlink r:id="rId15">
+              <w:r>
+                <w:rPr>
+                  <w:rFonts w:ascii="Calibri" w:hAnsi="Calibri"/>
+                  <w:color w:val="16202A"/>
+                  <w:sz w:val="16"/>
+                </w:rPr>
+                <w:t xml:space="preserve">aANFb2EAAAAJ</w:t>
+              </w:r>
+            </w:hyperlink>
+          </w:p>
+          <w:p>
+            <w:pPr>
+              <w:spacing w:before="0" w:after="0" w:line="276" w:lineRule="auto"/>
+            </w:pPr>
+            <w:r>
+              <w:rPr>
+                <w:rFonts w:ascii="Calibri" w:hAnsi="Calibri" w:eastAsia="Calibri"/>
+                <w:b w:val="0"/>
+                <w:i w:val="0"/>
+                <w:caps/>
+                <w:color w:val="5B6670"/>
+                <w:sz w:val="13"/>
+                <w:spacing w:val="20"/>
+              </w:rPr>
+              <w:t>Scopus</w:t>
+            </w:r>
+          </w:p>
+          <w:p>
+            <w:pPr>
+              <w:spacing w:before="0" w:after="60" w:line="276" w:lineRule="auto"/>
+            </w:pPr>
+            <w:r>
+              <w:rPr>
+                <w:rFonts w:ascii="Calibri" w:hAnsi="Calibri" w:eastAsia="Calibri"/>
+                <w:b w:val="0"/>
+                <w:i w:val="0"/>
+                <w:caps w:val="0"/>
+                <w:color w:val="16202A"/>
+                <w:sz w:val="16"/>
+              </w:rPr>
+              <w:t>60345533200</w:t>
+            </w:r>
+          </w:p>
+          <w:p>
+            <w:pPr>
+              <w:spacing w:before="0" w:after="0" w:line="276" w:lineRule="auto"/>
+            </w:pPr>
+            <w:r>
+              <w:rPr>
+                <w:rFonts w:ascii="Calibri" w:hAnsi="Calibri" w:eastAsia="Calibri"/>
+                <w:b w:val="0"/>
+                <w:i w:val="0"/>
+                <w:caps/>
+                <w:color w:val="5B6670"/>
+                <w:sz w:val="13"/>
+                <w:spacing w:val="20"/>
+              </w:rPr>
+              <w:t>Website</w:t>
+            </w:r>
+          </w:p>
+          <w:p>
+            <w:pPr>
+              <w:spacing w:before="0" w:after="60" w:line="276" w:lineRule="auto"/>
+            </w:pPr>
+            <w:hyperlink r:id="rId16">
+              <w:r>
+                <w:rPr>
+                  <w:rFonts w:ascii="Calibri" w:hAnsi="Calibri"/>
+                  <w:color w:val="16202A"/>
+                  <w:sz w:val="16"/>
+                </w:rPr>
+                <w:t xml:space="preserve">maheshbasavaraj.github.io</w:t>
+              </w:r>
+            </w:hyperlink>
+          </w:p>
+          <w:p>
+            <w:pPr>
+              <w:keepNext/>
+              <w:spacing w:before="200" w:after="80" w:line="276" w:lineRule="auto"/>
+              <w:pBdr>
+                <w:bottom w:val="single" w:sz="4" w:space="1" w:color="DCDFE2"/>
+              </w:pBdr>
+            </w:pPr>
+            <w:r>
+              <w:rPr>
+                <w:rFonts w:ascii="Calibri" w:hAnsi="Calibri" w:eastAsia="Calibri"/>
+                <w:b/>
+                <w:i w:val="0"/>
+                <w:caps/>
+                <w:color w:val="0E5A5C"/>
+                <w:sz w:val="16"/>
+                <w:spacing w:val="40"/>
+              </w:rPr>
+              <w:t>At a glance</w:t>
+            </w:r>
+          </w:p>
+          <w:tbl>
+            <w:tblPr>
+              <w:tblW w:type="auto" w:w="0"/>
+              <w:tblLayout w:type="fixed"/>
+              <w:tblLook w:firstColumn="1" w:firstRow="1" w:lastColumn="0" w:lastRow="0" w:noHBand="0" w:noVBand="1" w:val="04A0"/>
+            </w:tblPr>
+            <w:tblGrid>
+              <w:gridCol w:w="1870"/>
+              <w:gridCol w:w="1870"/>
+            </w:tblGrid>
+            <w:tr>
+              <w:tc>
+                <w:tcPr>
+                  <w:tcW w:type="dxa" w:w="1417"/>
+                  <w:tcMar>
+                    <w:top w:w="0" w:type="dxa"/>
+                    <w:left w:w="0" w:type="dxa"/>
+                    <w:bottom w:w="0" w:type="dxa"/>
+                    <w:right w:w="0" w:type="dxa"/>
+                  </w:tcMar>
+                </w:tcPr>
+                <w:p>
+                  <w:pPr>
+                    <w:spacing w:before="0" w:after="0" w:line="240" w:lineRule="auto"/>
+                  </w:pPr>
+                  <w:r>
+                    <w:rPr>
+                      <w:rFonts w:ascii="Georgia" w:hAnsi="Georgia" w:eastAsia="Georgia"/>
+                      <w:b/>
+                      <w:i w:val="0"/>
+                      <w:caps w:val="0"/>
+                      <w:color w:val="0E5A5C"/>
+                      <w:sz w:val="32"/>
+                    </w:rPr>
+                    <w:t>8</w:t>
+                  </w:r>
+                </w:p>
+                <w:p>
+                  <w:pPr>
+                    <w:spacing w:before="0" w:after="80" w:line="240" w:lineRule="auto"/>
+                  </w:pPr>
+                  <w:r>
+                    <w:rPr>
+                      <w:rFonts w:ascii="Calibri" w:hAnsi="Calibri" w:eastAsia="Calibri"/>
+                      <w:b w:val="0"/>
+                      <w:i w:val="0"/>
+                      <w:caps w:val="0"/>
+                      <w:color w:val="5B6670"/>
+                      <w:sz w:val="14"/>
+                    </w:rPr>
+                    <w:t>years teaching CS</w:t>
+                  </w:r>
+                </w:p>
+              </w:tc>
+              <w:tc>
+                <w:tcPr>
+                  <w:tcW w:type="dxa" w:w="1417"/>
+                  <w:tcMar>
+                    <w:top w:w="0" w:type="dxa"/>
+                    <w:left w:w="0" w:type="dxa"/>
+                    <w:bottom w:w="0" w:type="dxa"/>
+                    <w:right w:w="0" w:type="dxa"/>
+                  </w:tcMar>
+                </w:tcPr>
+                <w:p>
+                  <w:pPr>
+                    <w:spacing w:before="0" w:after="0" w:line="240" w:lineRule="auto"/>
+                  </w:pPr>
+                  <w:r>
+                    <w:rPr>
+                      <w:rFonts w:ascii="Georgia" w:hAnsi="Georgia" w:eastAsia="Georgia"/>
+                      <w:b/>
+                      <w:i w:val="0"/>
+                      <w:caps w:val="0"/>
+                      <w:color w:val="0E5A5C"/>
+                      <w:sz w:val="32"/>
+                    </w:rPr>
+                    <w:t>11</w:t>
+                  </w:r>
+                </w:p>
+                <w:p>
+                  <w:pPr>
+                    <w:spacing w:before="0" w:after="80" w:line="240" w:lineRule="auto"/>
+                  </w:pPr>
+                  <w:r>
+                    <w:rPr>
+                      <w:rFonts w:ascii="Calibri" w:hAnsi="Calibri" w:eastAsia="Calibri"/>
+                      <w:b w:val="0"/>
+                      <w:i w:val="0"/>
+                      <w:caps w:val="0"/>
+                      <w:color w:val="5B6670"/>
+                      <w:sz w:val="14"/>
+                    </w:rPr>
+                    <w:t>peer-reviewed papers</w:t>
+                  </w:r>
+                </w:p>
+              </w:tc>
+            </w:tr>
+            <w:tr>
+              <w:tc>
+                <w:tcPr>
+                  <w:tcW w:type="dxa" w:w="1417"/>
+                  <w:tcMar>
+                    <w:top w:w="0" w:type="dxa"/>
+                    <w:left w:w="0" w:type="dxa"/>
+                    <w:bottom w:w="0" w:type="dxa"/>
+                    <w:right w:w="0" w:type="dxa"/>
+                  </w:tcMar>
+                </w:tcPr>
+                <w:p>
+                  <w:pPr>
+                    <w:spacing w:before="0" w:after="0" w:line="240" w:lineRule="auto"/>
+                  </w:pPr>
+                  <w:r>
+                    <w:rPr>
+                      <w:rFonts w:ascii="Georgia" w:hAnsi="Georgia" w:eastAsia="Georgia"/>
+                      <w:b/>
+                      <w:i w:val="0"/>
+                      <w:caps w:val="0"/>
+                      <w:color w:val="0E5A5C"/>
+                      <w:sz w:val="32"/>
+                    </w:rPr>
+                    <w:t>4</w:t>
+                  </w:r>
+                </w:p>
+                <w:p>
+                  <w:pPr>
+                    <w:spacing w:before="0" w:after="80" w:line="240" w:lineRule="auto"/>
+                  </w:pPr>
+                  <w:r>
+                    <w:rPr>
+                      <w:rFonts w:ascii="Calibri" w:hAnsi="Calibri" w:eastAsia="Calibri"/>
+                      <w:b w:val="0"/>
+                      <w:i w:val="0"/>
+                      <w:caps w:val="0"/>
+                      <w:color w:val="5B6670"/>
+                      <w:sz w:val="14"/>
+                    </w:rPr>
+                    <w:t>patents &amp; applications</w:t>
+                  </w:r>
+                </w:p>
+              </w:tc>
+              <w:tc>
+                <w:tcPr>
+                  <w:tcW w:type="dxa" w:w="1417"/>
+                  <w:tcMar>
+                    <w:top w:w="0" w:type="dxa"/>
+                    <w:left w:w="0" w:type="dxa"/>
+                    <w:bottom w:w="0" w:type="dxa"/>
+                    <w:right w:w="0" w:type="dxa"/>
+                  </w:tcMar>
+                </w:tcPr>
+                <w:p>
+                  <w:pPr>
+                    <w:spacing w:before="0" w:after="0" w:line="240" w:lineRule="auto"/>
+                  </w:pPr>
+                  <w:r>
+                    <w:rPr>
+                      <w:rFonts w:ascii="Georgia" w:hAnsi="Georgia" w:eastAsia="Georgia"/>
+                      <w:b/>
+                      <w:i w:val="0"/>
+                      <w:caps w:val="0"/>
+                      <w:color w:val="0E5A5C"/>
+                      <w:sz w:val="32"/>
+                    </w:rPr>
+                    <w:t>8</w:t>
+                  </w:r>
+                </w:p>
+                <w:p>
+                  <w:pPr>
+                    <w:spacing w:before="0" w:after="80" w:line="240" w:lineRule="auto"/>
+                  </w:pPr>
+                  <w:r>
+                    <w:rPr>
+                      <w:rFonts w:ascii="Calibri" w:hAnsi="Calibri" w:eastAsia="Calibri"/>
+                      <w:b w:val="0"/>
+                      <w:i w:val="0"/>
+                      <w:caps w:val="0"/>
+                      <w:color w:val="5B6670"/>
+                      <w:sz w:val="14"/>
+                    </w:rPr>
+                    <w:t>teaching tools built</w:t>
+                  </w:r>
+                </w:p>
+              </w:tc>
+            </w:tr>
+          </w:tbl>
+          <w:p/>
+        </w:tc>
+        <w:tc>
+          <w:tcPr>
+            <w:tcW w:type="dxa" w:w="8163"/>
+            <w:tcMar>
+              <w:top w:w="737" w:type="dxa"/>
+              <w:left w:w="510" w:type="dxa"/>
+              <w:bottom w:w="453" w:type="dxa"/>
+              <w:right w:w="623" w:type="dxa"/>
+            </w:tcMar>
+            <w:tcBorders>
+              <w:top w:val="nil"/>
+              <w:left w:val="nil"/>
+              <w:bottom w:val="nil"/>
+              <w:right w:val="nil"/>
+            </w:tcBorders>
+          </w:tcPr>
+          <w:p>
+            <w:pPr>
+              <w:spacing w:before="0" w:after="20" w:line="252" w:lineRule="auto"/>
+            </w:pPr>
+            <w:r>
+              <w:rPr>
+                <w:rFonts w:ascii="Georgia" w:hAnsi="Georgia" w:eastAsia="Georgia"/>
+                <w:b/>
+                <w:i w:val="0"/>
+                <w:caps w:val="0"/>
+                <w:color w:val="16202A"/>
+                <w:sz w:val="34"/>
+              </w:rPr>
+              <w:t>Cover Letter</w:t>
+            </w:r>
+          </w:p>
+          <w:p>
+            <w:pPr>
+              <w:spacing w:before="0" w:after="120" w:line="276" w:lineRule="auto"/>
+            </w:pPr>
+            <w:r>
+              <w:rPr>
+                <w:rFonts w:ascii="Calibri" w:hAnsi="Calibri" w:eastAsia="Calibri"/>
+                <w:b/>
+                <w:i w:val="0"/>
+                <w:caps/>
+                <w:color w:val="B8742A"/>
+                <w:sz w:val="15"/>
+                <w:spacing w:val="12"/>
+              </w:rPr>
+              <w:t>Prepared for the Assistant Professor (Computer Science) role — UNSW Bengaluru Campus</w:t>
+            </w:r>
+          </w:p>
+          <w:p>
+            <w:pPr>
+              <w:spacing w:before="0" w:after="100" w:line="276" w:lineRule="auto"/>
+            </w:pPr>
+            <w:r>
+              <w:rPr>
+                <w:rFonts w:ascii="Calibri" w:hAnsi="Calibri" w:eastAsia="Calibri"/>
+                <w:b w:val="0"/>
+                <w:i w:val="0"/>
+                <w:caps w:val="0"/>
+                <w:color w:val="5B6670"/>
+                <w:sz w:val="16"/>
+              </w:rPr>
+              <w:t xml:space="preserve">25 October 2026  ·  </w:t>
+            </w:r>
+            <w:r>
+              <w:rPr>
+                <w:rFonts w:ascii="Calibri" w:hAnsi="Calibri" w:eastAsia="Calibri"/>
+                <w:b w:val="0"/>
+                <w:i w:val="0"/>
+                <w:caps w:val="0"/>
+                <w:color w:val="5B6670"/>
+                <w:sz w:val="16"/>
+              </w:rPr>
+              <w:t>The Selection Committee — Faculty Recruitment · UNSW Bengaluru · Embassy Manyata Business Park, Nagavara, Bengaluru 560045</w:t>
+            </w:r>
+          </w:p>
+          <w:p>
+            <w:pPr>
+              <w:spacing w:before="60" w:after="120" w:line="276" w:lineRule="auto"/>
+            </w:pPr>
+            <w:r>
+              <w:rPr>
+                <w:rFonts w:ascii="Calibri" w:hAnsi="Calibri" w:eastAsia="Calibri"/>
+                <w:b/>
+                <w:i w:val="0"/>
+                <w:caps w:val="0"/>
+                <w:color w:val="0E5A5C"/>
+                <w:sz w:val="18"/>
+              </w:rPr>
+              <w:t xml:space="preserve">Re:  </w:t>
+            </w:r>
+            <w:r>
+              <w:rPr>
+                <w:rFonts w:ascii="Calibri" w:hAnsi="Calibri" w:eastAsia="Calibri"/>
+                <w:b/>
+                <w:i w:val="0"/>
+                <w:caps w:val="0"/>
+                <w:color w:val="16202A"/>
+                <w:sz w:val="18"/>
+              </w:rPr>
+              <w:t>Application for Assistant Professor, Computer Science — UNSW Bengaluru Campus</w:t>
+            </w:r>
+          </w:p>
+          <w:p>
+            <w:pPr>
+              <w:spacing w:before="0" w:after="120" w:line="283" w:lineRule="auto"/>
+            </w:pPr>
+            <w:r>
+              <w:rPr>
+                <w:rFonts w:ascii="Calibri" w:hAnsi="Calibri" w:eastAsia="Calibri"/>
+                <w:b w:val="0"/>
+                <w:i w:val="0"/>
+                <w:caps w:val="0"/>
+                <w:color w:val="333F4A"/>
+                <w:sz w:val="18"/>
+              </w:rPr>
+              <w:t>Dear Members of the Selection Committee,</w:t>
+            </w:r>
+          </w:p>
+          <w:p>
+            <w:pPr>
+              <w:spacing w:before="0" w:after="100" w:line="283" w:lineRule="auto"/>
+            </w:pPr>
+            <w:r>
+              <w:rPr>
+                <w:rFonts w:ascii="Calibri" w:hAnsi="Calibri" w:eastAsia="Calibri"/>
+                <w:b w:val="0"/>
+                <w:i w:val="0"/>
+                <w:caps w:val="0"/>
+                <w:color w:val="333F4A"/>
+                <w:sz w:val="18"/>
+              </w:rPr>
+              <w:t>I am applying for the Assistant Professor, Computer Science position at the UNSW Bengaluru campus. I am currently Assistant Professor in CSE (Data Science) at DSATM, Bengaluru, and a doctoral researcher at Visvesvaraya Technological University. My sixteen years divide evenly between industry and academia, and both halves taught me the same habit: when a course needs software to make its ideas visible, I build it.</w:t>
+            </w:r>
+          </w:p>
+          <w:p>
+            <w:pPr>
+              <w:keepNext/>
+              <w:spacing w:before="200" w:after="80" w:line="276" w:lineRule="auto"/>
+              <w:pBdr>
+                <w:bottom w:val="single" w:sz="4" w:space="1" w:color="DCDFE2"/>
+              </w:pBdr>
+            </w:pPr>
+            <w:r>
+              <w:rPr>
+                <w:rFonts w:ascii="Calibri" w:hAnsi="Calibri" w:eastAsia="Calibri"/>
+                <w:b/>
+                <w:i w:val="0"/>
+                <w:caps/>
+                <w:color w:val="0E5A5C"/>
+                <w:sz w:val="16"/>
+                <w:spacing w:val="40"/>
+              </w:rPr>
+              <w:t>Teaching Software I Have Built</w:t>
+            </w:r>
+          </w:p>
+          <w:p>
+            <w:pPr>
+              <w:spacing w:before="0" w:after="50" w:line="274" w:lineRule="auto"/>
+              <w:ind w:left="204" w:hanging="204"/>
+            </w:pPr>
+            <w:r>
+              <w:rPr>
+                <w:rFonts w:ascii="Calibri" w:hAnsi="Calibri" w:eastAsia="Calibri"/>
+                <w:b w:val="0"/>
+                <w:i w:val="0"/>
+                <w:caps w:val="0"/>
+                <w:color w:val="B8742A"/>
+                <w:sz w:val="14"/>
+              </w:rPr>
+              <w:t xml:space="preserve">▪ </w:t>
+            </w:r>
+            <w:r>
+              <w:rPr>
+                <w:rFonts w:ascii="Calibri" w:hAnsi="Calibri" w:eastAsia="Calibri"/>
+                <w:b/>
+                <w:i w:val="0"/>
+                <w:caps w:val="0"/>
+                <w:color w:val="16202A"/>
+                <w:sz w:val="17"/>
+              </w:rPr>
+              <w:t xml:space="preserve">CPU Rush — </w:t>
+            </w:r>
+            <w:r>
+              <w:rPr>
+                <w:rFonts w:ascii="Calibri" w:hAnsi="Calibri" w:eastAsia="Calibri"/>
+                <w:b w:val="0"/>
+                <w:i w:val="0"/>
+                <w:caps w:val="0"/>
+                <w:color w:val="333F4A"/>
+                <w:sz w:val="17"/>
+              </w:rPr>
+              <w:t>OS students predict scheduling, paging, deadlock and file systems, commit to an answer, and a server grades every decision.</w:t>
+            </w:r>
+          </w:p>
+          <w:p>
+            <w:pPr>
+              <w:spacing w:before="0" w:after="50" w:line="274" w:lineRule="auto"/>
+              <w:ind w:left="204" w:hanging="204"/>
+            </w:pPr>
+            <w:r>
+              <w:rPr>
+                <w:rFonts w:ascii="Calibri" w:hAnsi="Calibri" w:eastAsia="Calibri"/>
+                <w:b w:val="0"/>
+                <w:i w:val="0"/>
+                <w:caps w:val="0"/>
+                <w:color w:val="B8742A"/>
+                <w:sz w:val="14"/>
+              </w:rPr>
+              <w:t xml:space="preserve">▪ </w:t>
+            </w:r>
+            <w:r>
+              <w:rPr>
+                <w:rFonts w:ascii="Calibri" w:hAnsi="Calibri" w:eastAsia="Calibri"/>
+                <w:b/>
+                <w:i w:val="0"/>
+                <w:caps w:val="0"/>
+                <w:color w:val="16202A"/>
+                <w:sz w:val="17"/>
+              </w:rPr>
+              <w:t xml:space="preserve">Data Structure Design Studio — </w:t>
+            </w:r>
+            <w:r>
+              <w:rPr>
+                <w:rFonts w:ascii="Calibri" w:hAnsi="Calibri" w:eastAsia="Calibri"/>
+                <w:b w:val="0"/>
+                <w:i w:val="0"/>
+                <w:caps w:val="0"/>
+                <w:color w:val="333F4A"/>
+                <w:sz w:val="17"/>
+              </w:rPr>
+              <w:t>a progressive, scored decision track under changing constraints.</w:t>
+            </w:r>
+          </w:p>
+          <w:p>
+            <w:pPr>
+              <w:spacing w:before="0" w:after="50" w:line="274" w:lineRule="auto"/>
+              <w:ind w:left="204" w:hanging="204"/>
+            </w:pPr>
+            <w:r>
+              <w:rPr>
+                <w:rFonts w:ascii="Calibri" w:hAnsi="Calibri" w:eastAsia="Calibri"/>
+                <w:b w:val="0"/>
+                <w:i w:val="0"/>
+                <w:caps w:val="0"/>
+                <w:color w:val="B8742A"/>
+                <w:sz w:val="14"/>
+              </w:rPr>
+              <w:t xml:space="preserve">▪ </w:t>
+            </w:r>
+            <w:r>
+              <w:rPr>
+                <w:rFonts w:ascii="Calibri" w:hAnsi="Calibri" w:eastAsia="Calibri"/>
+                <w:b/>
+                <w:i w:val="0"/>
+                <w:caps w:val="0"/>
+                <w:color w:val="16202A"/>
+                <w:sz w:val="17"/>
+              </w:rPr>
+              <w:t xml:space="preserve">Game Forge — </w:t>
+            </w:r>
+            <w:r>
+              <w:rPr>
+                <w:rFonts w:ascii="Calibri" w:hAnsi="Calibri" w:eastAsia="Calibri"/>
+                <w:b w:val="0"/>
+                <w:i w:val="0"/>
+                <w:caps w:val="0"/>
+                <w:color w:val="333F4A"/>
+                <w:sz w:val="17"/>
+              </w:rPr>
+              <w:t>generates single-file browser games, one concept each.</w:t>
+            </w:r>
+          </w:p>
+          <w:p>
+            <w:pPr>
+              <w:spacing w:before="0" w:after="50" w:line="274" w:lineRule="auto"/>
+              <w:ind w:left="204" w:hanging="204"/>
+            </w:pPr>
+            <w:r>
+              <w:rPr>
+                <w:rFonts w:ascii="Calibri" w:hAnsi="Calibri" w:eastAsia="Calibri"/>
+                <w:b w:val="0"/>
+                <w:i w:val="0"/>
+                <w:caps w:val="0"/>
+                <w:color w:val="B8742A"/>
+                <w:sz w:val="14"/>
+              </w:rPr>
+              <w:t xml:space="preserve">▪ </w:t>
+            </w:r>
+            <w:r>
+              <w:rPr>
+                <w:rFonts w:ascii="Calibri" w:hAnsi="Calibri" w:eastAsia="Calibri"/>
+                <w:b/>
+                <w:i w:val="0"/>
+                <w:caps w:val="0"/>
+                <w:color w:val="16202A"/>
+                <w:sz w:val="17"/>
+              </w:rPr>
+              <w:t xml:space="preserve">ButterCloud Quiz — </w:t>
+            </w:r>
+            <w:r>
+              <w:rPr>
+                <w:rFonts w:ascii="Calibri" w:hAnsi="Calibri" w:eastAsia="Calibri"/>
+                <w:b w:val="0"/>
+                <w:i w:val="0"/>
+                <w:caps w:val="0"/>
+                <w:color w:val="333F4A"/>
+                <w:sz w:val="17"/>
+              </w:rPr>
+              <w:t>students choose the best stack and architecture for realistic requirements.</w:t>
+            </w:r>
+          </w:p>
+          <w:p>
+            <w:pPr>
+              <w:spacing w:before="40" w:after="100" w:line="278" w:lineRule="auto"/>
+            </w:pPr>
+            <w:r>
+              <w:rPr>
+                <w:rFonts w:ascii="Calibri" w:hAnsi="Calibri" w:eastAsia="Calibri"/>
+                <w:b w:val="0"/>
+                <w:i w:val="0"/>
+                <w:caps w:val="0"/>
+                <w:color w:val="333F4A"/>
+                <w:sz w:val="18"/>
+              </w:rPr>
+              <w:t>Eight such tools are public at github.com/maheshbasavaraj and in daily classroom use, and every course I teach produces more. These are not demonstrations — they are how the syllabus is taught.</w:t>
+            </w:r>
+          </w:p>
+          <w:p>
+            <w:pPr>
+              <w:keepNext/>
+              <w:spacing w:before="200" w:after="80" w:line="276" w:lineRule="auto"/>
+              <w:pBdr>
+                <w:bottom w:val="single" w:sz="4" w:space="1" w:color="DCDFE2"/>
+              </w:pBdr>
+            </w:pPr>
+            <w:r>
+              <w:rPr>
+                <w:rFonts w:ascii="Calibri" w:hAnsi="Calibri" w:eastAsia="Calibri"/>
+                <w:b/>
+                <w:i w:val="0"/>
+                <w:caps/>
+                <w:color w:val="0E5A5C"/>
+                <w:sz w:val="16"/>
+                <w:spacing w:val="40"/>
+              </w:rPr>
+              <w:t>How I Teach</w:t>
+            </w:r>
+          </w:p>
+          <w:p>
+            <w:pPr>
+              <w:spacing w:before="0" w:after="100" w:line="283" w:lineRule="auto"/>
+            </w:pPr>
+            <w:r>
+              <w:rPr>
+                <w:rFonts w:ascii="Calibri" w:hAnsi="Calibri" w:eastAsia="Calibri"/>
+                <w:b w:val="0"/>
+                <w:i w:val="0"/>
+                <w:caps w:val="0"/>
+                <w:color w:val="333F4A"/>
+                <w:sz w:val="18"/>
+              </w:rPr>
+              <w:t>I teach through case studies and from first principles. I start with the basic necessity of a topic — why it exists, what breaks without it — and only then show how it works. The why earns a student's attention; the how earns the skill. Wherever a subject allows, the learning is hands-on: students decide, watch the machine answer, and correct themselves. They leave with a mental model they can defend, not definitions they can recite.</w:t>
+            </w:r>
+          </w:p>
+          <w:p>
+            <w:pPr>
+              <w:keepNext/>
+              <w:spacing w:before="200" w:after="80" w:line="276" w:lineRule="auto"/>
+              <w:pBdr>
+                <w:bottom w:val="single" w:sz="4" w:space="1" w:color="DCDFE2"/>
+              </w:pBdr>
+            </w:pPr>
+            <w:r>
+              <w:rPr>
+                <w:rFonts w:ascii="Calibri" w:hAnsi="Calibri" w:eastAsia="Calibri"/>
+                <w:b/>
+                <w:i w:val="0"/>
+                <w:caps/>
+                <w:color w:val="0E5A5C"/>
+                <w:sz w:val="16"/>
+                <w:spacing w:val="40"/>
+              </w:rPr>
+              <w:t>Teaching Experience</w:t>
+            </w:r>
+          </w:p>
+          <w:p>
+            <w:pPr>
+              <w:spacing w:before="0" w:after="100" w:line="283" w:lineRule="auto"/>
+            </w:pPr>
+            <w:r>
+              <w:rPr>
+                <w:rFonts w:ascii="Calibri" w:hAnsi="Calibri" w:eastAsia="Calibri"/>
+                <w:b w:val="0"/>
+                <w:i w:val="0"/>
+                <w:caps w:val="0"/>
+                <w:color w:val="333F4A"/>
+                <w:sz w:val="18"/>
+              </w:rPr>
+              <w:t>I have taught object-oriented programming, data structures, operating systems, database systems and deep learning at undergraduate and postgraduate level, and I supervise capstone projects end to end. At DSATM I designed and led a six-month Agentic AI immersion with Capabl and run faculty development programmes for colleagues. I am ready to adopt myExperience and the Integrated Curriculum Framework, to work within standards-based assessment, and to complete Ready to Teach.</w:t>
+            </w:r>
+          </w:p>
+          <w:p>
+            <w:pPr>
+              <w:keepNext/>
+              <w:spacing w:before="200" w:after="80" w:line="276" w:lineRule="auto"/>
+              <w:pBdr>
+                <w:bottom w:val="single" w:sz="4" w:space="1" w:color="DCDFE2"/>
+              </w:pBdr>
+            </w:pPr>
+            <w:r>
+              <w:rPr>
+                <w:rFonts w:ascii="Calibri" w:hAnsi="Calibri" w:eastAsia="Calibri"/>
+                <w:b/>
+                <w:i w:val="0"/>
+                <w:caps/>
+                <w:color w:val="0E5A5C"/>
+                <w:sz w:val="16"/>
+                <w:spacing w:val="40"/>
+              </w:rPr>
+              <w:t>Research and Industry</w:t>
+            </w:r>
+          </w:p>
+          <w:p>
+            <w:pPr>
+              <w:spacing w:before="0" w:after="100" w:line="283" w:lineRule="auto"/>
+            </w:pPr>
+            <w:r>
+              <w:rPr>
+                <w:rFonts w:ascii="Calibri" w:hAnsi="Calibri" w:eastAsia="Calibri"/>
+                <w:b w:val="0"/>
+                <w:i w:val="0"/>
+                <w:caps w:val="0"/>
+                <w:color w:val="333F4A"/>
+                <w:sz w:val="18"/>
+              </w:rPr>
+              <w:t>My research in Agentic AI, large language models and spatio-temporal deep learning has produced three utility patents, a published application and eleven peer-reviewed papers — work that fits this campus's AI focus and its Centre of Excellence with Deloitte India. Eight years at Infosys and Accenture let me build work-integrated learning around real repositories, code review and delivery discipline.</w:t>
+            </w:r>
+          </w:p>
+          <w:p>
+            <w:pPr>
+              <w:spacing w:before="40" w:after="120" w:line="283" w:lineRule="auto"/>
+            </w:pPr>
+            <w:r>
+              <w:rPr>
+                <w:rFonts w:ascii="Calibri" w:hAnsi="Calibri" w:eastAsia="Calibri"/>
+                <w:b w:val="0"/>
+                <w:i w:val="0"/>
+                <w:caps w:val="0"/>
+                <w:color w:val="333F4A"/>
+                <w:sz w:val="18"/>
+              </w:rPr>
+              <w:t>UNSW Bengaluru offers a top-20 global degree with local consequence, and Progress for All is a mission I can teach to. Helping establish a new campus's standards rather than inherit them is rare. I am based in Bengaluru, ready from the first teaching period, and glad to demonstrate CPU Rush live or teach a class on any topic in the curriculum.</w:t>
+            </w:r>
+          </w:p>
+          <w:p>
+            <w:pPr>
+              <w:spacing w:before="120" w:after="20" w:line="288" w:lineRule="auto"/>
+            </w:pPr>
+            <w:r>
+              <w:rPr>
+                <w:rFonts w:ascii="Calibri" w:hAnsi="Calibri" w:eastAsia="Calibri"/>
+                <w:b w:val="0"/>
+                <w:i w:val="0"/>
+                <w:caps w:val="0"/>
+                <w:color w:val="333F4A"/>
+                <w:sz w:val="18"/>
+              </w:rPr>
+              <w:t>Yours sincerely,</w:t>
+            </w:r>
+          </w:p>
+          <w:p>
+            <w:pPr>
+              <w:spacing w:before="200" w:after="0" w:line="252" w:lineRule="auto"/>
+            </w:pPr>
+            <w:r>
+              <w:rPr>
+                <w:rFonts w:ascii="Georgia" w:hAnsi="Georgia" w:eastAsia="Georgia"/>
+                <w:b/>
+                <w:i w:val="0"/>
+                <w:caps w:val="0"/>
+                <w:color w:val="16202A"/>
+                <w:sz w:val="25"/>
+              </w:rPr>
+              <w:t>Mahesh Basavaraj</w:t>
+            </w:r>
+          </w:p>
+          <w:p>
+            <w:pPr>
+              <w:spacing w:before="0" w:after="0" w:line="252" w:lineRule="auto"/>
+            </w:pPr>
+            <w:r>
+              <w:rPr>
+                <w:rFonts w:ascii="Calibri" w:hAnsi="Calibri" w:eastAsia="Calibri"/>
+                <w:b w:val="0"/>
+                <w:i w:val="0"/>
+                <w:caps w:val="0"/>
+                <w:color w:val="5B6670"/>
+                <w:sz w:val="16"/>
+              </w:rPr>
+              <w:t>Assistant Professor, CSE (Data Science) · DSATM, Bengaluru</w:t>
+            </w:r>
+          </w:p>
+          <w:p>
+            <w:pPr>
+              <w:spacing w:before="160" w:after="0" w:line="288" w:lineRule="auto"/>
+              <w:pBdr>
+                <w:bottom w:val="single" w:sz="4" w:space="4" w:color="DCDFE2"/>
+              </w:pBdr>
+            </w:pPr>
+          </w:p>
+          <w:p>
+            <w:pPr>
+              <w:spacing w:before="60" w:after="0" w:line="300" w:lineRule="auto"/>
+            </w:pPr>
+            <w:r>
+              <w:rPr>
+                <w:rFonts w:ascii="Calibri" w:hAnsi="Calibri" w:eastAsia="Calibri"/>
+                <w:b/>
+                <w:i w:val="0"/>
+                <w:caps/>
+                <w:color w:val="0E5A5C"/>
+                <w:sz w:val="16"/>
+                <w:spacing w:val="10"/>
+              </w:rPr>
+              <w:t xml:space="preserve">Enclosures:  </w:t>
+            </w:r>
+            <w:r>
+              <w:rPr>
+                <w:rFonts w:ascii="Calibri" w:hAnsi="Calibri" w:eastAsia="Calibri"/>
+                <w:b w:val="0"/>
+                <w:i w:val="0"/>
+                <w:caps w:val="0"/>
+                <w:color w:val="5B6670"/>
+                <w:sz w:val="16"/>
+              </w:rPr>
+              <w:t>Curriculum Vitae  ·  Research Publications &amp; Patents  ·  Teaching Methodology</w:t>
+            </w:r>
+          </w:p>
+        </w:tc>
+      </w:tr>
+    </w:tbl>
     <w:p>
       <w:pPr>
-        <w:spacing w:before="0" w:after="0" w:line="240" w:lineRule="auto"/>
+        <w:spacing w:before="0" w:after="0" w:line="20" w:lineRule="exact"/>
+        <w:rPr>
+          <w:sz w:val="2"/>
+          <w:szCs w:val="2"/>
+          <w:vanish/>
+        </w:rPr>
       </w:pPr>
-      <w:r>
-        <w:rPr>
-          <w:rFonts w:ascii="Georgia" w:hAnsi="Georgia" w:eastAsia="Georgia"/>
-          <w:b/>
-          <w:i w:val="0"/>
-          <w:caps w:val="0"/>
-          <w:color w:val="16202A"/>
-          <w:sz w:val="38"/>
-        </w:rPr>
-        <w:t>Mahesh Basavaraj</w:t>
-      </w:r>
-    </w:p>
-    <w:p>
-      <w:pPr>
-        <w:spacing w:before="0" w:after="20" w:line="240" w:lineRule="auto"/>
-      </w:pPr>
-      <w:r>
-        <w:rPr>
-          <w:rFonts w:ascii="Calibri" w:hAnsi="Calibri" w:eastAsia="Calibri"/>
-          <w:b w:val="0"/>
-          <w:i w:val="0"/>
-          <w:caps w:val="0"/>
-          <w:color w:val="5B6670"/>
-          <w:sz w:val="17"/>
-        </w:rPr>
-        <w:t>Assistant Professor, Computer Science &amp; Engineering (Data Science) · DSATM, Bengaluru</w:t>
-      </w:r>
-    </w:p>
-    <w:p>
-      <w:pPr>
-        <w:spacing w:before="0" w:after="60" w:line="240" w:lineRule="auto"/>
-        <w:pBdr>
-          <w:bottom w:val="single" w:sz="12" w:space="6" w:color="0E5A5C"/>
-        </w:pBdr>
-      </w:pPr>
-      <w:r>
-        <w:rPr>
-          <w:rFonts w:ascii="Calibri" w:hAnsi="Calibri" w:eastAsia="Calibri"/>
-          <w:b w:val="0"/>
-          <w:i w:val="0"/>
-          <w:caps w:val="0"/>
-          <w:color w:val="5B6670"/>
-          <w:sz w:val="17"/>
-        </w:rPr>
-        <w:t xml:space="preserve">Bengaluru, India  ·  </w:t>
-      </w:r>
-      <w:hyperlink r:id="rId11">
-        <w:r>
-          <w:rPr>
-            <w:rFonts w:ascii="Calibri" w:hAnsi="Calibri"/>
-            <w:color w:val="0E5A5C"/>
-            <w:sz w:val="17"/>
-          </w:rPr>
-          <w:t xml:space="preserve">BMaheshbasavaraj@gmail.com</w:t>
-        </w:r>
-      </w:hyperlink>
-      <w:r>
-        <w:rPr>
-          <w:rFonts w:ascii="Calibri" w:hAnsi="Calibri" w:eastAsia="Calibri"/>
-          <w:b w:val="0"/>
-          <w:i w:val="0"/>
-          <w:caps w:val="0"/>
-          <w:color w:val="5B6670"/>
-          <w:sz w:val="17"/>
-        </w:rPr>
-        <w:t xml:space="preserve">  ·  +91 98866 42542  ·  </w:t>
-      </w:r>
-      <w:hyperlink r:id="rId12">
-        <w:r>
-          <w:rPr>
-            <w:rFonts w:ascii="Calibri" w:hAnsi="Calibri"/>
-            <w:color w:val="0E5A5C"/>
-            <w:sz w:val="17"/>
-          </w:rPr>
-          <w:t xml:space="preserve">maheshbasavaraj.github.io</w:t>
-        </w:r>
-      </w:hyperlink>
-      <w:r>
-        <w:rPr>
-          <w:rFonts w:ascii="Calibri" w:hAnsi="Calibri" w:eastAsia="Calibri"/>
-          <w:b w:val="0"/>
-          <w:i w:val="0"/>
-          <w:caps w:val="0"/>
-          <w:color w:val="5B6670"/>
-          <w:sz w:val="17"/>
-        </w:rPr>
-        <w:t xml:space="preserve">  ·  </w:t>
-      </w:r>
-      <w:hyperlink r:id="rId13">
-        <w:r>
-          <w:rPr>
-            <w:rFonts w:ascii="Calibri" w:hAnsi="Calibri"/>
-            <w:color w:val="0E5A5C"/>
-            <w:sz w:val="17"/>
-          </w:rPr>
-          <w:t xml:space="preserve">LinkedIn</w:t>
-        </w:r>
-      </w:hyperlink>
-    </w:p>
-    <w:p>
-      <w:pPr>
-        <w:spacing w:before="140" w:after="120" w:line="240" w:lineRule="auto"/>
-      </w:pPr>
-      <w:r>
-        <w:rPr>
-          <w:rFonts w:ascii="Calibri" w:hAnsi="Calibri" w:eastAsia="Calibri"/>
-          <w:b w:val="0"/>
-          <w:i w:val="0"/>
-          <w:caps w:val="0"/>
-          <w:color w:val="5B6670"/>
-          <w:sz w:val="18"/>
-        </w:rPr>
-        <w:t>25 October 2026</w:t>
-      </w:r>
-    </w:p>
-    <w:p>
-      <w:pPr>
-        <w:spacing w:before="0" w:after="0" w:line="269" w:lineRule="auto"/>
-      </w:pPr>
-      <w:r>
-        <w:rPr>
-          <w:rFonts w:ascii="Calibri" w:hAnsi="Calibri" w:eastAsia="Calibri"/>
-          <w:b/>
-          <w:i w:val="0"/>
-          <w:caps w:val="0"/>
-          <w:color w:val="16202A"/>
-          <w:sz w:val="18"/>
-        </w:rPr>
-        <w:t>The Selection Committee — Faculty Recruitment</w:t>
-      </w:r>
-    </w:p>
-    <w:p>
-      <w:pPr>
-        <w:spacing w:before="0" w:after="0" w:line="269" w:lineRule="auto"/>
-      </w:pPr>
-      <w:r>
-        <w:rPr>
-          <w:rFonts w:ascii="Calibri" w:hAnsi="Calibri" w:eastAsia="Calibri"/>
-          <w:b/>
-          <w:i w:val="0"/>
-          <w:caps w:val="0"/>
-          <w:color w:val="16202A"/>
-          <w:sz w:val="18"/>
-        </w:rPr>
-        <w:t>UNSW Bengaluru</w:t>
-      </w:r>
-    </w:p>
-    <w:p>
-      <w:pPr>
-        <w:spacing w:before="0" w:after="0" w:line="269" w:lineRule="auto"/>
-      </w:pPr>
-      <w:r>
-        <w:rPr>
-          <w:rFonts w:ascii="Calibri" w:hAnsi="Calibri" w:eastAsia="Calibri"/>
-          <w:b w:val="0"/>
-          <w:i w:val="0"/>
-          <w:caps w:val="0"/>
-          <w:color w:val="5B6670"/>
-          <w:sz w:val="18"/>
-        </w:rPr>
-        <w:t>Embassy Manyata Business Park, Nagavara</w:t>
-      </w:r>
-    </w:p>
-    <w:p>
-      <w:pPr>
-        <w:spacing w:before="0" w:after="0" w:line="269" w:lineRule="auto"/>
-      </w:pPr>
-      <w:r>
-        <w:rPr>
-          <w:rFonts w:ascii="Calibri" w:hAnsi="Calibri" w:eastAsia="Calibri"/>
-          <w:b w:val="0"/>
-          <w:i w:val="0"/>
-          <w:caps w:val="0"/>
-          <w:color w:val="5B6670"/>
-          <w:sz w:val="18"/>
-        </w:rPr>
-        <w:t>Bengaluru 560045, Karnataka, India</w:t>
-      </w:r>
-    </w:p>
-    <w:p>
-      <w:pPr>
-        <w:spacing w:before="180" w:after="140" w:line="276" w:lineRule="auto"/>
-      </w:pPr>
-      <w:r>
-        <w:rPr>
-          <w:rFonts w:ascii="Calibri" w:hAnsi="Calibri" w:eastAsia="Calibri"/>
-          <w:b/>
-          <w:i w:val="0"/>
-          <w:caps w:val="0"/>
-          <w:color w:val="0E5A5C"/>
-          <w:sz w:val="19"/>
-        </w:rPr>
-        <w:t xml:space="preserve">Re:  </w:t>
-      </w:r>
-      <w:r>
-        <w:rPr>
-          <w:rFonts w:ascii="Calibri" w:hAnsi="Calibri" w:eastAsia="Calibri"/>
-          <w:b/>
-          <w:i w:val="0"/>
-          <w:caps w:val="0"/>
-          <w:color w:val="16202A"/>
-          <w:sz w:val="19"/>
-        </w:rPr>
-        <w:t>Application for Assistant Professor, Computer Science — UNSW Bengaluru Campus</w:t>
-      </w:r>
-    </w:p>
-    <w:p>
-      <w:pPr>
-        <w:spacing w:before="0" w:after="120" w:line="283" w:lineRule="auto"/>
-      </w:pPr>
-      <w:r>
-        <w:rPr>
-          <w:rFonts w:ascii="Calibri" w:hAnsi="Calibri" w:eastAsia="Calibri"/>
-          <w:b w:val="0"/>
-          <w:i w:val="0"/>
-          <w:caps w:val="0"/>
-          <w:color w:val="333F4A"/>
-          <w:sz w:val="19"/>
-        </w:rPr>
-        <w:t>Dear Members of the Selection Committee,</w:t>
-      </w:r>
-    </w:p>
-    <w:p>
-      <w:pPr>
-        <w:spacing w:before="100" w:after="100" w:line="283" w:lineRule="auto"/>
-      </w:pPr>
-      <w:r>
-        <w:rPr>
-          <w:rFonts w:ascii="Calibri" w:hAnsi="Calibri" w:eastAsia="Calibri"/>
-          <w:b w:val="0"/>
-          <w:i w:val="0"/>
-          <w:caps w:val="0"/>
-          <w:color w:val="333F4A"/>
-          <w:sz w:val="19"/>
-        </w:rPr>
-        <w:t>I am applying for the position of Assistant Professor, Computer Science, at the UNSW Bengaluru campus. I am currently Assistant Professor in CSE (Data Science) at DSATM, Bengaluru, and a doctoral researcher at Visvesvaraya Technological University. My sixteen years split evenly between the two worlds this campus sits between: eight years building banking and capital-markets software at Infosys and Accenture, and eight years teaching computer science and publishing applied AI research. What I would most want you to know about me is simple: when a course needs software to make its ideas visible, I build it.</w:t>
-      </w:r>
-    </w:p>
-    <w:p>
-      <w:pPr>
-        <w:spacing w:before="100" w:after="100" w:line="283" w:lineRule="auto"/>
-      </w:pPr>
-      <w:r>
-        <w:rPr>
-          <w:rFonts w:ascii="Calibri" w:hAnsi="Calibri" w:eastAsia="Calibri"/>
-          <w:b w:val="0"/>
-          <w:i w:val="0"/>
-          <w:caps w:val="0"/>
-          <w:color w:val="333F4A"/>
-          <w:sz w:val="19"/>
-        </w:rPr>
-        <w:t>CPU Rush is the clearest example. My Operating Systems students do not read about scheduling, paging, deadlock and file systems — they predict how each behaves, commit to an answer, and a server grades every decision. Data Structure Design Studio turns data structures into a progressive, scored decision track under changing constraints. Game Forge generates single-file browser games, one concept each, from an editable design doctrine. ButterCloud Quiz asks students to choose the best stack and architecture for Eight such tools are public at github.com/maheshbasavaraj, most in daily classroom use, and every new course I teach keeps producing more — students decide, then watch the machine answer, which is where the learning actually happens.</w:t>
-      </w:r>
-    </w:p>
-    <w:p>
-      <w:pPr>
-        <w:spacing w:before="100" w:after="100" w:line="283" w:lineRule="auto"/>
-      </w:pPr>
-      <w:r>
-        <w:rPr>
-          <w:rFonts w:ascii="Calibri" w:hAnsi="Calibri" w:eastAsia="Calibri"/>
-          <w:b w:val="0"/>
-          <w:i w:val="0"/>
-          <w:caps w:val="0"/>
-          <w:color w:val="333F4A"/>
-          <w:sz w:val="19"/>
-        </w:rPr>
-        <w:t>I have taught object-oriented programming, data structures, operating systems, database systems and deep learning at undergraduate and postgraduate level, and I supervise final-year capstone projects end to end. At DSATM I designed and led a six-month Agentic AI immersion programme with Capabl and run faculty development programmes for colleagues. I am ready to adopt UNSW's myExperience framework and the Integrated Curriculum Framework, to work within standards-based, criterion-referenced assessment, and to complete Ready to Teach alongside colleagues from Kensington.</w:t>
-      </w:r>
-    </w:p>
-    <w:p>
-      <w:pPr>
-        <w:spacing w:before="100" w:after="100" w:line="283" w:lineRule="auto"/>
-      </w:pPr>
-      <w:r>
-        <w:rPr>
-          <w:rFonts w:ascii="Calibri" w:hAnsi="Calibri" w:eastAsia="Calibri"/>
-          <w:b w:val="0"/>
-          <w:i w:val="0"/>
-          <w:caps w:val="0"/>
-          <w:color w:val="333F4A"/>
-          <w:sz w:val="19"/>
-        </w:rPr>
-        <w:t>My research — Agentic AI, large language models and spatio-temporal deep learning — has produced three utility patents, a published patent application in synchronised social-VR IoT networks, and eleven peer-reviewed papers, including recent work on multi-scale spatio-temporal attention networks, lightweight multi-agent Q-learning for wireless IoT, and LLM-based agent systems as a route to general intelligence. The campus's focus on artificial intelligence, and its Centre of Excellence in AI and Innovation with Deloitte India, is where I want to work: applied research that produces both publications and capability.</w:t>
-      </w:r>
-    </w:p>
-    <w:p>
-      <w:pPr>
-        <w:spacing w:before="100" w:after="100" w:line="283" w:lineRule="auto"/>
-      </w:pPr>
-      <w:r>
-        <w:rPr>
-          <w:rFonts w:ascii="Calibri" w:hAnsi="Calibri" w:eastAsia="Calibri"/>
-          <w:b w:val="0"/>
-          <w:i w:val="0"/>
-          <w:caps w:val="0"/>
-          <w:color w:val="333F4A"/>
-          <w:sz w:val="19"/>
-        </w:rPr>
-        <w:t>Eight years in industry also taught me what employers expect from a computer science graduate. At Infosys I worked on Finacle, the universal banking platform; at Accenture I built capital-markets systems for international clients. I would bring that into work-integrated learning — industry projects, internship pipelines, and assessment built around real repositories, code review and delivery discipline.</w:t>
-      </w:r>
-    </w:p>
-    <w:p>
-      <w:pPr>
-        <w:spacing w:before="100" w:after="100" w:line="283" w:lineRule="auto"/>
-      </w:pPr>
-      <w:r>
-        <w:rPr>
-          <w:rFonts w:ascii="Calibri" w:hAnsi="Calibri" w:eastAsia="Calibri"/>
-          <w:b w:val="0"/>
-          <w:i w:val="0"/>
-          <w:caps w:val="0"/>
-          <w:color w:val="333F4A"/>
-          <w:sz w:val="19"/>
-        </w:rPr>
-        <w:t>UNSW Bengaluru offers a top-20 global degree with local consequence, and Progress for All is a mission I can teach to. The chance to help establish a new campus's standards rather than inherit them is rare. I am based in Bengaluru, ready from the first teaching period, and glad to demonstrate CPU Rush live or teach a class on any topic in the curriculum.</w:t>
-      </w:r>
-    </w:p>
-    <w:p>
-      <w:pPr>
-        <w:spacing w:before="140" w:after="20" w:line="288" w:lineRule="auto"/>
-      </w:pPr>
-      <w:r>
-        <w:rPr>
-          <w:rFonts w:ascii="Calibri" w:hAnsi="Calibri" w:eastAsia="Calibri"/>
-          <w:b w:val="0"/>
-          <w:i w:val="0"/>
-          <w:caps w:val="0"/>
-          <w:color w:val="333F4A"/>
-          <w:sz w:val="19"/>
-        </w:rPr>
-        <w:t>Yours sincerely,</w:t>
-      </w:r>
-    </w:p>
-    <w:p>
-      <w:pPr>
-        <w:spacing w:before="220" w:after="0" w:line="252" w:lineRule="auto"/>
-      </w:pPr>
-      <w:r>
-        <w:rPr>
-          <w:rFonts w:ascii="Georgia" w:hAnsi="Georgia" w:eastAsia="Georgia"/>
-          <w:b/>
-          <w:i w:val="0"/>
-          <w:caps w:val="0"/>
-          <w:color w:val="16202A"/>
-          <w:sz w:val="25"/>
-        </w:rPr>
-        <w:t>Mahesh Basavaraj</w:t>
-      </w:r>
-    </w:p>
-    <w:p>
-      <w:pPr>
-        <w:spacing w:before="0" w:after="0" w:line="252" w:lineRule="auto"/>
-      </w:pPr>
-      <w:r>
-        <w:rPr>
-          <w:rFonts w:ascii="Calibri" w:hAnsi="Calibri" w:eastAsia="Calibri"/>
-          <w:b w:val="0"/>
-          <w:i w:val="0"/>
-          <w:caps w:val="0"/>
-          <w:color w:val="5B6670"/>
-          <w:sz w:val="16"/>
-        </w:rPr>
-        <w:t>Assistant Professor, CSE (Data Science) · DSATM, Bengaluru</w:t>
-      </w:r>
-    </w:p>
-    <w:p>
-      <w:pPr>
-        <w:spacing w:before="180" w:after="0" w:line="288" w:lineRule="auto"/>
-        <w:pBdr>
-          <w:bottom w:val="single" w:sz="4" w:space="4" w:color="DCDFE2"/>
-        </w:pBdr>
-      </w:pPr>
-    </w:p>
-    <w:p>
-      <w:pPr>
-        <w:spacing w:before="60" w:after="0" w:line="300" w:lineRule="auto"/>
-      </w:pPr>
-      <w:r>
-        <w:rPr>
-          <w:rFonts w:ascii="Calibri" w:hAnsi="Calibri" w:eastAsia="Calibri"/>
-          <w:b/>
-          <w:i w:val="0"/>
-          <w:caps/>
-          <w:color w:val="0E5A5C"/>
-          <w:sz w:val="16"/>
-          <w:spacing w:val="10"/>
-        </w:rPr>
-        <w:t xml:space="preserve">Enclosures:  </w:t>
-      </w:r>
-      <w:r>
-        <w:rPr>
-          <w:rFonts w:ascii="Calibri" w:hAnsi="Calibri" w:eastAsia="Calibri"/>
-          <w:b w:val="0"/>
-          <w:i w:val="0"/>
-          <w:caps w:val="0"/>
-          <w:color w:val="5B6670"/>
-          <w:sz w:val="16"/>
-        </w:rPr>
-        <w:t>Curriculum Vitae  ·  Research Publications &amp; Patents  ·  Teaching Methodology</w:t>
-      </w:r>
     </w:p>
     <w:sectPr>
       <w:headerReference w:type="default" r:id="rId9"/>
       <w:footerReference w:type="default" r:id="rId10"/>
       <w:pgSz w:w="11906" w:h="16838"/>
-      <w:pgMar w:top="794" w:right="1191" w:bottom="737" w:left="1191" w:header="0" w:footer="0" w:gutter="0"/>
+      <w:pgMar w:top="0" w:right="0" w:bottom="0" w:left="0" w:header="0" w:footer="0" w:gutter="0"/>
       <w:cols w:space="720"/>
       <w:docGrid w:linePitch="360"/>
     </w:sectPr>
@@ -444,6 +1203,49 @@
         <w:sz w:val="2"/>
       </w:rPr>
     </w:pPr>
+    <w:r xmlns:a="http://schemas.openxmlformats.org/drawingml/2006/main">
+      <w:drawing>
+        <wp:anchor distT="0" distB="0" distL="0" distR="0" simplePos="0" relativeHeight="0" behindDoc="1" locked="1" layoutInCell="0" allowOverlap="1">
+          <wp:simplePos x="0" y="0"/>
+          <wp:positionH relativeFrom="page">
+            <wp:posOffset>0</wp:posOffset>
+          </wp:positionH>
+          <wp:positionV relativeFrom="page">
+            <wp:posOffset>0</wp:posOffset>
+          </wp:positionV>
+          <wp:extent cx="2376000" cy="10692000"/>
+          <wp:effectExtent l="0" t="0" r="0" b="0"/>
+          <wp:wrapNone/>
+          <wp:docPr id="99" name="SidebarStrip"/>
+          <wp:cNvGraphicFramePr/>
+          <a:graphic>
+            <a:graphicData uri="http://schemas.microsoft.com/office/word/2010/wordprocessingShape">
+              <wps:wsp>
+                <wps:cNvSpPr/>
+                <wps:spPr>
+                  <a:xfrm>
+                    <a:off x="0" y="0"/>
+                    <a:ext cx="2376000" cy="10692000"/>
+                  </a:xfrm>
+                  <a:prstGeom prst="rect">
+                    <a:avLst/>
+                  </a:prstGeom>
+                  <a:solidFill>
+                    <a:srgbClr val="F3F1EC"/>
+                  </a:solidFill>
+                  <a:ln w="6350">
+                    <a:solidFill>
+                      <a:srgbClr val="DCDFE2"/>
+                    </a:solidFill>
+                  </a:ln>
+                </wps:spPr>
+                <wps:bodyPr/>
+              </wps:wsp>
+            </a:graphicData>
+          </a:graphic>
+        </wp:anchor>
+      </w:drawing>
+    </w:r>
   </w:p>
 </w:hdr>
 </file>

</xml_diff>